<commit_message>
Updated platform features.I just want to make it clear that we will later implement github actions
</commit_message>
<xml_diff>
--- a/Requirements_and_documents/Vision_statement_platform/PLATFORM-FEATURES.docx
+++ b/Requirements_and_documents/Vision_statement_platform/PLATFORM-FEATURES.docx
@@ -15,9 +15,6 @@
         <w:t xml:space="preserve">                                            </w:t>
       </w:r>
       <w:r>
-        <w:rPr>
-          <w:lang w:val="el-GR"/>
-        </w:rPr>
         <w:t xml:space="preserve">  </w:t>
       </w:r>
       <w:r>
@@ -232,11 +229,7 @@
         <w:pStyle w:val="2"/>
       </w:pPr>
       <w:r>
-        <w:t>2</w:t>
-      </w:r>
-      <w:proofErr w:type="gramStart"/>
-      <w:r>
-        <w:t>.</w:t>
+        <w:t>2.</w:t>
       </w:r>
       <w:r>
         <w:rPr>
@@ -249,11 +242,10 @@
         <w:t xml:space="preserve"> </w:t>
       </w:r>
       <w:r>
-        <w:t xml:space="preserve"> Integration</w:t>
-      </w:r>
-      <w:proofErr w:type="gramEnd"/>
-      <w:r>
-        <w:t xml:space="preserve"> Features (Git layer)</w:t>
+        <w:t xml:space="preserve"> Integration Features (Git layer)</w:t>
+      </w:r>
+      <w:r>
+        <w:t xml:space="preserve"> (Later)</w:t>
       </w:r>
     </w:p>
     <w:p>
@@ -459,6 +451,9 @@
       <w:r>
         <w:t>)</w:t>
       </w:r>
+      <w:r>
+        <w:t xml:space="preserve"> (Later)</w:t>
+      </w:r>
     </w:p>
     <w:p>
       <w:r>
@@ -466,6 +461,12 @@
       </w:r>
       <w:r>
         <w:t>Auto-linking PRs to tasks</w:t>
+      </w:r>
+      <w:r>
+        <w:t xml:space="preserve"> </w:t>
+      </w:r>
+      <w:r>
+        <w:t>(Later)</w:t>
       </w:r>
     </w:p>
     <w:p>
@@ -543,6 +544,9 @@
       <w:r>
         <w:t>PR review time</w:t>
       </w:r>
+      <w:r>
+        <w:t xml:space="preserve"> </w:t>
+      </w:r>
     </w:p>
     <w:p>
       <w:r>
@@ -584,13 +588,8 @@
       </w:r>
     </w:p>
     <w:p>
-      <w:proofErr w:type="gramStart"/>
-      <w:r>
-        <w:t>k.</w:t>
-      </w:r>
-      <w:proofErr w:type="gramEnd"/>
-      <w:r>
-        <w:t xml:space="preserve"> Employee’s evaluation written reports</w:t>
+      <w:r>
+        <w:t>k. Employee’s evaluation written reports</w:t>
       </w:r>
     </w:p>
     <w:p/>
@@ -1599,6 +1598,7 @@
   <w:style w:type="character" w:default="1" w:styleId="a0">
     <w:name w:val="Default Paragraph Font"/>
     <w:uiPriority w:val="1"/>
+    <w:semiHidden/>
     <w:unhideWhenUsed/>
   </w:style>
   <w:style w:type="table" w:default="1" w:styleId="a1">

</xml_diff>